<commit_message>
Add zeta potential stability protocol and prophetic stability example
- stability_study/zeta_potential_stability_protocol.md: 3-month ICH Q1A
  design (5 C, 25 C, 40 C), Zetasizer method, acceptance criteria and blank
  data-capture tables for zeta potential, Z-average/PdI, pH and peroxide value.
- Draft: Example 7 added as a clearly labelled prophetic example (present
  tense, no measured values) to be replaced by measured data before filing.

Co-Authored-By: Claude Fable 5.1 <noreply@anthropic.com>
Claude-Session: https://claude.ai/code/session_01KMAZg8i9uqNcDzQZ84HHS2
</commit_message>
<xml_diff>
--- a/ozoil_nanoemulsion_patent/PCT_Application_Draft_Ozonated_Olive_Oil_Nanoemulsion.docx
+++ b/ozoil_nanoemulsion_patent/PCT_Application_Draft_Ozonated_Olive_Oil_Nanoemulsion.docx
@@ -14489,6 +14489,29 @@
           <w:szCs w:val="24"/>
         </w:rPr>
         <w:t xml:space="preserve">[0058] [DRAFTING NOTE: The following data should be added before filing to strengthen the application, in particular for inventive step and sufficiency: (a) zeta potential of each formulation; (b) peroxide value and/or ozonide content (e.g. by 1H/13C-NMR signal at about 104 ppm for the trioxolane carbon, or FT-IR band at about 1104 cm-1) of the oil before processing and of the nanoemulsion after processing and after 1, 3 and 6 months at 2–8 °C and 25 °C, to demonstrate preservation of the active; (c) Z-average and PdI on storage; (d) a comparative example with lecithin alone and with polysorbate 80 alone at 3.4% w/v, to demonstrate the synergy of the binary system; (e) a comparative example with a conventional valve homogeniser; (f) antimicrobial activity (e.g. MIC against Staphylococcus aureus, Escherichia coli, Candida albicans) of the nanoemulsion versus bulk ozonated oil at equal oil content.]</w:t>
+      </w:r>
+    </w:p>
+    <w:p>
+      <w:pPr>
+        <w:pStyle w:val="Heading4"/>
+        <w:spacing w:after="160" w:before="280"/>
+      </w:pPr>
+      <w:r>
+        <w:t xml:space="preserve">Example 7 — Physical stability study (prophetic example)</w:t>
+      </w:r>
+    </w:p>
+    <w:p>
+      <w:pPr>
+        <w:spacing w:after="160" w:line="300"/>
+        <w:jc w:val="both"/>
+      </w:pPr>
+      <w:r>
+        <w:rPr>
+          <w:rFonts w:ascii="Times New Roman" w:cs="Times New Roman" w:eastAsia="Times New Roman" w:hAnsi="Times New Roman"/>
+          <w:sz w:val="24"/>
+          <w:szCs w:val="24"/>
+        </w:rPr>
+        <w:t xml:space="preserve">[0058a] [PROPHETIC EXAMPLE — written in the present tense; no measurements have yet been made. Replace with measured data from the protocol in stability_study/zeta_potential_stability_protocol.md before filing, or retain only if the attorney confirms that a clearly labelled prophetic example is acceptable in the chosen jurisdictions.] Nanoemulsions F1 to F4 prepared according to Examples 1, 4, 5 and 6 (F12Y–H30Z, 30,000 psi, 3 passes) are filled under nitrogen into amber glass vials and stored at 5 ± 3 °C, at 25 °C/60% RH and at 40 °C/75% RH for three months. Zeta potential is determined at 25 °C after 1:100 dilution in 1 mM sodium chloride at the sample pH, using a Zetasizer Nano-ZS and the Smoluchowski model, together with Z-average, PdI, pH and peroxide value, at time zero and after 2 weeks, 1, 2 and 3 months. On the basis of the anionic phosphatidylcholine/phosphatidylethanolamine content of the lecithin and the pH of 5.0 ± 0.2, the droplets are expected to carry a negative surface charge with a zeta potential in the range of about −25 mV to −50 mV, the magnitude increasing with lecithin content (F3, F4 more negative than F1, F2) and being partly screened by the polyoxyethylene layer of polysorbate 80. A nanoemulsion according to the invention is considered stable when, over three months at 5 ± 3 °C, the zeta potential remains within −25 mV to −50 mV and changes by not more than 10 mV in absolute value, the Z-average changes by not more than 10%, the PdI remains at or below 0.15, no creaming or phase separation is visible, and the peroxide value of the extracted oil remains within the specification of the input oil.</w:t>
       </w:r>
     </w:p>
     <w:p>

</xml_diff>